<commit_message>
union comments for docx
</commit_message>
<xml_diff>
--- a/tests/docx/extremists/data/source.docx
+++ b/tests/docx/extremists/data/source.docx
@@ -12,7 +12,21 @@
         <w:rPr>
           <w:lang w:val="ru-RU"/>
         </w:rPr>
-        <w:t>Азиатская собака</w:t>
+        <w:t xml:space="preserve">Чёрная </w:t>
+      </w:r>
+      <w:r>
+        <w:rPr>
+          <w:b/>
+          <w:bCs/>
+          <w:lang w:val="ru-RU"/>
+        </w:rPr>
+        <w:t>японская</w:t>
+      </w:r>
+      <w:r>
+        <w:rPr>
+          <w:lang w:val="ru-RU"/>
+        </w:rPr>
+        <w:t xml:space="preserve"> собака</w:t>
       </w:r>
     </w:p>
     <w:sectPr>

</xml_diff>